<commit_message>
docs: release 1.4.0 pubblicata (link verificati su Cloudflare e GitHub)
Co-Authored-By: Claude Opus 5.5 <noreply@anthropic.com>
</commit_message>
<xml_diff>
--- a/docs/PDFz_20261024.docx
+++ b/docs/PDFz_20261024.docx
@@ -16,7 +16,7 @@
           <w:noProof/>
         </w:rPr>
         <w:drawing>
-          <wp:inline distT="0" distB="0" distL="0" distR="0" wp14:anchorId="622FC93B" wp14:editId="5E47BA8B">
+          <wp:inline distT="0" distB="0" distL="0" distR="0" wp14:anchorId="511C3D2B" wp14:editId="43637330">
             <wp:extent cx="3619500" cy="1285875"/>
             <wp:effectExtent l="0" t="0" r="0" b="0"/>
             <wp:docPr id="1" name="Immagine 1"/>
@@ -135,7 +135,7 @@
     <w:sdt>
       <w:sdtPr>
         <w:alias w:val="Indice"/>
-        <w:id w:val="-924799908"/>
+        <w:id w:val="-1404135855"/>
       </w:sdtPr>
       <w:sdtEndPr/>
       <w:sdtContent>
@@ -158,7 +158,7 @@
           <w:r>
             <w:fldChar w:fldCharType="separate"/>
           </w:r>
-          <w:hyperlink w:anchor="_Toc243774987" w:history="1">
+          <w:hyperlink w:anchor="_Toc243775762" w:history="1">
             <w:r>
               <w:rPr>
                 <w:rStyle w:val="Collegamentoipertestuale"/>
@@ -182,7 +182,7 @@
               <w:rPr>
                 <w:noProof/>
               </w:rPr>
-              <w:instrText xml:space="preserve"> PAGEREF _Toc243774987 \h </w:instrText>
+              <w:instrText xml:space="preserve"> PAGEREF _Toc243775762 \h </w:instrText>
             </w:r>
             <w:r>
               <w:rPr>
@@ -219,7 +219,7 @@
               <w:noProof/>
             </w:rPr>
           </w:pPr>
-          <w:hyperlink w:anchor="_Toc243774988" w:history="1">
+          <w:hyperlink w:anchor="_Toc243775763" w:history="1">
             <w:r>
               <w:rPr>
                 <w:rStyle w:val="Collegamentoipertestuale"/>
@@ -243,7 +243,7 @@
               <w:rPr>
                 <w:noProof/>
               </w:rPr>
-              <w:instrText xml:space="preserve"> PAGEREF _Toc243774988 \h </w:instrText>
+              <w:instrText xml:space="preserve"> PAGEREF _Toc243775763 \h </w:instrText>
             </w:r>
             <w:r>
               <w:rPr>
@@ -280,7 +280,7 @@
               <w:noProof/>
             </w:rPr>
           </w:pPr>
-          <w:hyperlink w:anchor="_Toc243774989" w:history="1">
+          <w:hyperlink w:anchor="_Toc243775764" w:history="1">
             <w:r>
               <w:rPr>
                 <w:rStyle w:val="Collegamentoipertestuale"/>
@@ -304,7 +304,7 @@
               <w:rPr>
                 <w:noProof/>
               </w:rPr>
-              <w:instrText xml:space="preserve"> PAGEREF _Toc243774989 \h </w:instrText>
+              <w:instrText xml:space="preserve"> PAGEREF _Toc243775764 \h </w:instrText>
             </w:r>
             <w:r>
               <w:rPr>
@@ -341,7 +341,7 @@
               <w:noProof/>
             </w:rPr>
           </w:pPr>
-          <w:hyperlink w:anchor="_Toc243774990" w:history="1">
+          <w:hyperlink w:anchor="_Toc243775765" w:history="1">
             <w:r>
               <w:rPr>
                 <w:rStyle w:val="Collegamentoipertestuale"/>
@@ -365,7 +365,7 @@
               <w:rPr>
                 <w:noProof/>
               </w:rPr>
-              <w:instrText xml:space="preserve"> PAGEREF _Toc243774990 \h </w:instrText>
+              <w:instrText xml:space="preserve"> PAGEREF _Toc243775765 \h </w:instrText>
             </w:r>
             <w:r>
               <w:rPr>
@@ -402,7 +402,7 @@
               <w:noProof/>
             </w:rPr>
           </w:pPr>
-          <w:hyperlink w:anchor="_Toc243774991" w:history="1">
+          <w:hyperlink w:anchor="_Toc243775766" w:history="1">
             <w:r>
               <w:rPr>
                 <w:rStyle w:val="Collegamentoipertestuale"/>
@@ -426,7 +426,7 @@
               <w:rPr>
                 <w:noProof/>
               </w:rPr>
-              <w:instrText xml:space="preserve"> PAGEREF _Toc243774991 \h </w:instrText>
+              <w:instrText xml:space="preserve"> PAGEREF _Toc243775766 \h </w:instrText>
             </w:r>
             <w:r>
               <w:rPr>
@@ -463,7 +463,7 @@
               <w:noProof/>
             </w:rPr>
           </w:pPr>
-          <w:hyperlink w:anchor="_Toc243774992" w:history="1">
+          <w:hyperlink w:anchor="_Toc243775767" w:history="1">
             <w:r>
               <w:rPr>
                 <w:rStyle w:val="Collegamentoipertestuale"/>
@@ -487,7 +487,7 @@
               <w:rPr>
                 <w:noProof/>
               </w:rPr>
-              <w:instrText xml:space="preserve"> PAGEREF _Toc243774992 \h </w:instrText>
+              <w:instrText xml:space="preserve"> PAGEREF _Toc243775767 \h </w:instrText>
             </w:r>
             <w:r>
               <w:rPr>
@@ -524,7 +524,7 @@
               <w:noProof/>
             </w:rPr>
           </w:pPr>
-          <w:hyperlink w:anchor="_Toc243774993" w:history="1">
+          <w:hyperlink w:anchor="_Toc243775768" w:history="1">
             <w:r>
               <w:rPr>
                 <w:rStyle w:val="Collegamentoipertestuale"/>
@@ -548,7 +548,7 @@
               <w:rPr>
                 <w:noProof/>
               </w:rPr>
-              <w:instrText xml:space="preserve"> PAGEREF _Toc243774993 \h </w:instrText>
+              <w:instrText xml:space="preserve"> PAGEREF _Toc243775768 \h </w:instrText>
             </w:r>
             <w:r>
               <w:rPr>
@@ -585,7 +585,7 @@
               <w:noProof/>
             </w:rPr>
           </w:pPr>
-          <w:hyperlink w:anchor="_Toc243774994" w:history="1">
+          <w:hyperlink w:anchor="_Toc243775769" w:history="1">
             <w:r>
               <w:rPr>
                 <w:rStyle w:val="Collegamentoipertestuale"/>
@@ -609,7 +609,7 @@
               <w:rPr>
                 <w:noProof/>
               </w:rPr>
-              <w:instrText xml:space="preserve"> PAGEREF _Toc243774994 \h </w:instrText>
+              <w:instrText xml:space="preserve"> PAGEREF _Toc243775769 \h </w:instrText>
             </w:r>
             <w:r>
               <w:rPr>
@@ -646,7 +646,7 @@
               <w:noProof/>
             </w:rPr>
           </w:pPr>
-          <w:hyperlink w:anchor="_Toc243774995" w:history="1">
+          <w:hyperlink w:anchor="_Toc243775770" w:history="1">
             <w:r>
               <w:rPr>
                 <w:rStyle w:val="Collegamentoipertestuale"/>
@@ -670,7 +670,7 @@
               <w:rPr>
                 <w:noProof/>
               </w:rPr>
-              <w:instrText xml:space="preserve"> PAGEREF _Toc243774995 \h </w:instrText>
+              <w:instrText xml:space="preserve"> PAGEREF _Toc243775770 \h </w:instrText>
             </w:r>
             <w:r>
               <w:rPr>
@@ -707,7 +707,7 @@
               <w:noProof/>
             </w:rPr>
           </w:pPr>
-          <w:hyperlink w:anchor="_Toc243774996" w:history="1">
+          <w:hyperlink w:anchor="_Toc243775771" w:history="1">
             <w:r>
               <w:rPr>
                 <w:rStyle w:val="Collegamentoipertestuale"/>
@@ -731,7 +731,7 @@
               <w:rPr>
                 <w:noProof/>
               </w:rPr>
-              <w:instrText xml:space="preserve"> PAGEREF _Toc243774996 \h </w:instrText>
+              <w:instrText xml:space="preserve"> PAGEREF _Toc243775771 \h </w:instrText>
             </w:r>
             <w:r>
               <w:rPr>
@@ -768,7 +768,7 @@
               <w:noProof/>
             </w:rPr>
           </w:pPr>
-          <w:hyperlink w:anchor="_Toc243774997" w:history="1">
+          <w:hyperlink w:anchor="_Toc243775772" w:history="1">
             <w:r>
               <w:rPr>
                 <w:rStyle w:val="Collegamentoipertestuale"/>
@@ -792,7 +792,7 @@
               <w:rPr>
                 <w:noProof/>
               </w:rPr>
-              <w:instrText xml:space="preserve"> PAGEREF _Toc243774997 \h </w:instrText>
+              <w:instrText xml:space="preserve"> PAGEREF _Toc243775772 \h </w:instrText>
             </w:r>
             <w:r>
               <w:rPr>
@@ -829,7 +829,7 @@
               <w:noProof/>
             </w:rPr>
           </w:pPr>
-          <w:hyperlink w:anchor="_Toc243774998" w:history="1">
+          <w:hyperlink w:anchor="_Toc243775773" w:history="1">
             <w:r>
               <w:rPr>
                 <w:rStyle w:val="Collegamentoipertestuale"/>
@@ -853,7 +853,7 @@
               <w:rPr>
                 <w:noProof/>
               </w:rPr>
-              <w:instrText xml:space="preserve"> PAGEREF _Toc243774998 \h </w:instrText>
+              <w:instrText xml:space="preserve"> PAGEREF _Toc243775773 \h </w:instrText>
             </w:r>
             <w:r>
               <w:rPr>
@@ -890,7 +890,7 @@
               <w:noProof/>
             </w:rPr>
           </w:pPr>
-          <w:hyperlink w:anchor="_Toc243774999" w:history="1">
+          <w:hyperlink w:anchor="_Toc243775774" w:history="1">
             <w:r>
               <w:rPr>
                 <w:rStyle w:val="Collegamentoipertestuale"/>
@@ -914,7 +914,7 @@
               <w:rPr>
                 <w:noProof/>
               </w:rPr>
-              <w:instrText xml:space="preserve"> PAGEREF _Toc243774999 \h </w:instrText>
+              <w:instrText xml:space="preserve"> PAGEREF _Toc243775774 \h </w:instrText>
             </w:r>
             <w:r>
               <w:rPr>
@@ -951,7 +951,7 @@
               <w:noProof/>
             </w:rPr>
           </w:pPr>
-          <w:hyperlink w:anchor="_Toc243775000" w:history="1">
+          <w:hyperlink w:anchor="_Toc243775775" w:history="1">
             <w:r>
               <w:rPr>
                 <w:rStyle w:val="Collegamentoipertestuale"/>
@@ -975,7 +975,7 @@
               <w:rPr>
                 <w:noProof/>
               </w:rPr>
-              <w:instrText xml:space="preserve"> PAGEREF _Toc243775000 \h </w:instrText>
+              <w:instrText xml:space="preserve"> PAGEREF _Toc243775775 \h </w:instrText>
             </w:r>
             <w:r>
               <w:rPr>
@@ -1012,7 +1012,7 @@
               <w:noProof/>
             </w:rPr>
           </w:pPr>
-          <w:hyperlink w:anchor="_Toc243775001" w:history="1">
+          <w:hyperlink w:anchor="_Toc243775776" w:history="1">
             <w:r>
               <w:rPr>
                 <w:rStyle w:val="Collegamentoipertestuale"/>
@@ -1036,7 +1036,7 @@
               <w:rPr>
                 <w:noProof/>
               </w:rPr>
-              <w:instrText xml:space="preserve"> PAGEREF _Toc243775001 \h </w:instrText>
+              <w:instrText xml:space="preserve"> PAGEREF _Toc243775776 \h </w:instrText>
             </w:r>
             <w:r>
               <w:rPr>
@@ -1073,7 +1073,7 @@
               <w:noProof/>
             </w:rPr>
           </w:pPr>
-          <w:hyperlink w:anchor="_Toc243775002" w:history="1">
+          <w:hyperlink w:anchor="_Toc243775777" w:history="1">
             <w:r>
               <w:rPr>
                 <w:rStyle w:val="Collegamentoipertestuale"/>
@@ -1097,7 +1097,7 @@
               <w:rPr>
                 <w:noProof/>
               </w:rPr>
-              <w:instrText xml:space="preserve"> PAGEREF _Toc243775002 \h </w:instrText>
+              <w:instrText xml:space="preserve"> PAGEREF _Toc243775777 \h </w:instrText>
             </w:r>
             <w:r>
               <w:rPr>
@@ -1134,7 +1134,7 @@
               <w:noProof/>
             </w:rPr>
           </w:pPr>
-          <w:hyperlink w:anchor="_Toc243775003" w:history="1">
+          <w:hyperlink w:anchor="_Toc243775778" w:history="1">
             <w:r>
               <w:rPr>
                 <w:rStyle w:val="Collegamentoipertestuale"/>
@@ -1158,7 +1158,7 @@
               <w:rPr>
                 <w:noProof/>
               </w:rPr>
-              <w:instrText xml:space="preserve"> PAGEREF _Toc243775003 \h </w:instrText>
+              <w:instrText xml:space="preserve"> PAGEREF _Toc243775778 \h </w:instrText>
             </w:r>
             <w:r>
               <w:rPr>
@@ -1195,7 +1195,7 @@
               <w:noProof/>
             </w:rPr>
           </w:pPr>
-          <w:hyperlink w:anchor="_Toc243775004" w:history="1">
+          <w:hyperlink w:anchor="_Toc243775779" w:history="1">
             <w:r>
               <w:rPr>
                 <w:rStyle w:val="Collegamentoipertestuale"/>
@@ -1219,7 +1219,7 @@
               <w:rPr>
                 <w:noProof/>
               </w:rPr>
-              <w:instrText xml:space="preserve"> PAGEREF _Toc243775004 \h </w:instrText>
+              <w:instrText xml:space="preserve"> PAGEREF _Toc243775779 \h </w:instrText>
             </w:r>
             <w:r>
               <w:rPr>
@@ -1256,7 +1256,7 @@
               <w:noProof/>
             </w:rPr>
           </w:pPr>
-          <w:hyperlink w:anchor="_Toc243775005" w:history="1">
+          <w:hyperlink w:anchor="_Toc243775780" w:history="1">
             <w:r>
               <w:rPr>
                 <w:rStyle w:val="Collegamentoipertestuale"/>
@@ -1280,7 +1280,7 @@
               <w:rPr>
                 <w:noProof/>
               </w:rPr>
-              <w:instrText xml:space="preserve"> PAGEREF _Toc243775005 \h </w:instrText>
+              <w:instrText xml:space="preserve"> PAGEREF _Toc243775780 \h </w:instrText>
             </w:r>
             <w:r>
               <w:rPr>
@@ -1317,7 +1317,7 @@
               <w:noProof/>
             </w:rPr>
           </w:pPr>
-          <w:hyperlink w:anchor="_Toc243775006" w:history="1">
+          <w:hyperlink w:anchor="_Toc243775781" w:history="1">
             <w:r>
               <w:rPr>
                 <w:rStyle w:val="Collegamentoipertestuale"/>
@@ -1341,7 +1341,7 @@
               <w:rPr>
                 <w:noProof/>
               </w:rPr>
-              <w:instrText xml:space="preserve"> PAGEREF _Toc243775006 \h </w:instrText>
+              <w:instrText xml:space="preserve"> PAGEREF _Toc243775781 \h </w:instrText>
             </w:r>
             <w:r>
               <w:rPr>
@@ -1378,7 +1378,7 @@
               <w:noProof/>
             </w:rPr>
           </w:pPr>
-          <w:hyperlink w:anchor="_Toc243775007" w:history="1">
+          <w:hyperlink w:anchor="_Toc243775782" w:history="1">
             <w:r>
               <w:rPr>
                 <w:rStyle w:val="Collegamentoipertestuale"/>
@@ -1402,7 +1402,7 @@
               <w:rPr>
                 <w:noProof/>
               </w:rPr>
-              <w:instrText xml:space="preserve"> PAGEREF _Toc243775007 \h </w:instrText>
+              <w:instrText xml:space="preserve"> PAGEREF _Toc243775782 \h </w:instrText>
             </w:r>
             <w:r>
               <w:rPr>
@@ -1439,7 +1439,7 @@
               <w:noProof/>
             </w:rPr>
           </w:pPr>
-          <w:hyperlink w:anchor="_Toc243775008" w:history="1">
+          <w:hyperlink w:anchor="_Toc243775783" w:history="1">
             <w:r>
               <w:rPr>
                 <w:rStyle w:val="Collegamentoipertestuale"/>
@@ -1463,7 +1463,7 @@
               <w:rPr>
                 <w:noProof/>
               </w:rPr>
-              <w:instrText xml:space="preserve"> PAGEREF _Toc243775008 \h </w:instrText>
+              <w:instrText xml:space="preserve"> PAGEREF _Toc243775783 \h </w:instrText>
             </w:r>
             <w:r>
               <w:rPr>
@@ -1500,7 +1500,7 @@
               <w:noProof/>
             </w:rPr>
           </w:pPr>
-          <w:hyperlink w:anchor="_Toc243775009" w:history="1">
+          <w:hyperlink w:anchor="_Toc243775784" w:history="1">
             <w:r>
               <w:rPr>
                 <w:rStyle w:val="Collegamentoipertestuale"/>
@@ -1524,7 +1524,7 @@
               <w:rPr>
                 <w:noProof/>
               </w:rPr>
-              <w:instrText xml:space="preserve"> PAGEREF _Toc243775009 \h </w:instrText>
+              <w:instrText xml:space="preserve"> PAGEREF _Toc243775784 \h </w:instrText>
             </w:r>
             <w:r>
               <w:rPr>
@@ -1561,7 +1561,7 @@
               <w:noProof/>
             </w:rPr>
           </w:pPr>
-          <w:hyperlink w:anchor="_Toc243775010" w:history="1">
+          <w:hyperlink w:anchor="_Toc243775785" w:history="1">
             <w:r>
               <w:rPr>
                 <w:rStyle w:val="Collegamentoipertestuale"/>
@@ -1585,7 +1585,7 @@
               <w:rPr>
                 <w:noProof/>
               </w:rPr>
-              <w:instrText xml:space="preserve"> PAGEREF _Toc243775010 \h </w:instrText>
+              <w:instrText xml:space="preserve"> PAGEREF _Toc243775785 \h </w:instrText>
             </w:r>
             <w:r>
               <w:rPr>
@@ -1622,7 +1622,7 @@
               <w:noProof/>
             </w:rPr>
           </w:pPr>
-          <w:hyperlink w:anchor="_Toc243775011" w:history="1">
+          <w:hyperlink w:anchor="_Toc243775786" w:history="1">
             <w:r>
               <w:rPr>
                 <w:rStyle w:val="Collegamentoipertestuale"/>
@@ -1646,7 +1646,7 @@
               <w:rPr>
                 <w:noProof/>
               </w:rPr>
-              <w:instrText xml:space="preserve"> PAGEREF _Toc243775011 \h </w:instrText>
+              <w:instrText xml:space="preserve"> PAGEREF _Toc243775786 \h </w:instrText>
             </w:r>
             <w:r>
               <w:rPr>
@@ -1683,7 +1683,7 @@
               <w:noProof/>
             </w:rPr>
           </w:pPr>
-          <w:hyperlink w:anchor="_Toc243775012" w:history="1">
+          <w:hyperlink w:anchor="_Toc243775787" w:history="1">
             <w:r>
               <w:rPr>
                 <w:rStyle w:val="Collegamentoipertestuale"/>
@@ -1707,7 +1707,7 @@
               <w:rPr>
                 <w:noProof/>
               </w:rPr>
-              <w:instrText xml:space="preserve"> PAGEREF _Toc243775012 \h </w:instrText>
+              <w:instrText xml:space="preserve"> PAGEREF _Toc243775787 \h </w:instrText>
             </w:r>
             <w:r>
               <w:rPr>
@@ -1744,7 +1744,7 @@
               <w:noProof/>
             </w:rPr>
           </w:pPr>
-          <w:hyperlink w:anchor="_Toc243775013" w:history="1">
+          <w:hyperlink w:anchor="_Toc243775788" w:history="1">
             <w:r>
               <w:rPr>
                 <w:rStyle w:val="Collegamentoipertestuale"/>
@@ -1768,7 +1768,7 @@
               <w:rPr>
                 <w:noProof/>
               </w:rPr>
-              <w:instrText xml:space="preserve"> PAGEREF _Toc243775013 \h </w:instrText>
+              <w:instrText xml:space="preserve"> PAGEREF _Toc243775788 \h </w:instrText>
             </w:r>
             <w:r>
               <w:rPr>
@@ -1805,7 +1805,7 @@
               <w:noProof/>
             </w:rPr>
           </w:pPr>
-          <w:hyperlink w:anchor="_Toc243775014" w:history="1">
+          <w:hyperlink w:anchor="_Toc243775789" w:history="1">
             <w:r>
               <w:rPr>
                 <w:rStyle w:val="Collegamentoipertestuale"/>
@@ -1829,7 +1829,7 @@
               <w:rPr>
                 <w:noProof/>
               </w:rPr>
-              <w:instrText xml:space="preserve"> PAGEREF _Toc243775014 \h </w:instrText>
+              <w:instrText xml:space="preserve"> PAGEREF _Toc243775789 \h </w:instrText>
             </w:r>
             <w:r>
               <w:rPr>
@@ -1866,7 +1866,7 @@
               <w:noProof/>
             </w:rPr>
           </w:pPr>
-          <w:hyperlink w:anchor="_Toc243775015" w:history="1">
+          <w:hyperlink w:anchor="_Toc243775790" w:history="1">
             <w:r>
               <w:rPr>
                 <w:rStyle w:val="Collegamentoipertestuale"/>
@@ -1890,7 +1890,7 @@
               <w:rPr>
                 <w:noProof/>
               </w:rPr>
-              <w:instrText xml:space="preserve"> PAGEREF _Toc243775015 \h </w:instrText>
+              <w:instrText xml:space="preserve"> PAGEREF _Toc243775790 \h </w:instrText>
             </w:r>
             <w:r>
               <w:rPr>
@@ -1927,7 +1927,7 @@
               <w:noProof/>
             </w:rPr>
           </w:pPr>
-          <w:hyperlink w:anchor="_Toc243775016" w:history="1">
+          <w:hyperlink w:anchor="_Toc243775791" w:history="1">
             <w:r>
               <w:rPr>
                 <w:rStyle w:val="Collegamentoipertestuale"/>
@@ -1951,7 +1951,7 @@
               <w:rPr>
                 <w:noProof/>
               </w:rPr>
-              <w:instrText xml:space="preserve"> PAGEREF _Toc243775016 \h </w:instrText>
+              <w:instrText xml:space="preserve"> PAGEREF _Toc243775791 \h </w:instrText>
             </w:r>
             <w:r>
               <w:rPr>
@@ -1988,7 +1988,7 @@
               <w:noProof/>
             </w:rPr>
           </w:pPr>
-          <w:hyperlink w:anchor="_Toc243775017" w:history="1">
+          <w:hyperlink w:anchor="_Toc243775792" w:history="1">
             <w:r>
               <w:rPr>
                 <w:rStyle w:val="Collegamentoipertestuale"/>
@@ -2012,7 +2012,7 @@
               <w:rPr>
                 <w:noProof/>
               </w:rPr>
-              <w:instrText xml:space="preserve"> PAGEREF _Toc243775017 \h </w:instrText>
+              <w:instrText xml:space="preserve"> PAGEREF _Toc243775792 \h </w:instrText>
             </w:r>
             <w:r>
               <w:rPr>
@@ -2049,7 +2049,7 @@
               <w:noProof/>
             </w:rPr>
           </w:pPr>
-          <w:hyperlink w:anchor="_Toc243775018" w:history="1">
+          <w:hyperlink w:anchor="_Toc243775793" w:history="1">
             <w:r>
               <w:rPr>
                 <w:rStyle w:val="Collegamentoipertestuale"/>
@@ -2073,7 +2073,7 @@
               <w:rPr>
                 <w:noProof/>
               </w:rPr>
-              <w:instrText xml:space="preserve"> PAGEREF _Toc243775018 \h </w:instrText>
+              <w:instrText xml:space="preserve"> PAGEREF _Toc243775793 \h </w:instrText>
             </w:r>
             <w:r>
               <w:rPr>
@@ -2110,7 +2110,7 @@
               <w:noProof/>
             </w:rPr>
           </w:pPr>
-          <w:hyperlink w:anchor="_Toc243775019" w:history="1">
+          <w:hyperlink w:anchor="_Toc243775794" w:history="1">
             <w:r>
               <w:rPr>
                 <w:rStyle w:val="Collegamentoipertestuale"/>
@@ -2134,7 +2134,7 @@
               <w:rPr>
                 <w:noProof/>
               </w:rPr>
-              <w:instrText xml:space="preserve"> PAGEREF _Toc243775019 \h </w:instrText>
+              <w:instrText xml:space="preserve"> PAGEREF _Toc243775794 \h </w:instrText>
             </w:r>
             <w:r>
               <w:rPr>
@@ -2171,7 +2171,7 @@
               <w:noProof/>
             </w:rPr>
           </w:pPr>
-          <w:hyperlink w:anchor="_Toc243775020" w:history="1">
+          <w:hyperlink w:anchor="_Toc243775795" w:history="1">
             <w:r>
               <w:rPr>
                 <w:rStyle w:val="Collegamentoipertestuale"/>
@@ -2195,7 +2195,7 @@
               <w:rPr>
                 <w:noProof/>
               </w:rPr>
-              <w:instrText xml:space="preserve"> PAGEREF _Toc243775020 \h </w:instrText>
+              <w:instrText xml:space="preserve"> PAGEREF _Toc243775795 \h </w:instrText>
             </w:r>
             <w:r>
               <w:rPr>
@@ -2232,7 +2232,7 @@
               <w:noProof/>
             </w:rPr>
           </w:pPr>
-          <w:hyperlink w:anchor="_Toc243775021" w:history="1">
+          <w:hyperlink w:anchor="_Toc243775796" w:history="1">
             <w:r>
               <w:rPr>
                 <w:rStyle w:val="Collegamentoipertestuale"/>
@@ -2256,7 +2256,7 @@
               <w:rPr>
                 <w:noProof/>
               </w:rPr>
-              <w:instrText xml:space="preserve"> PAGEREF _Toc243775021 \h </w:instrText>
+              <w:instrText xml:space="preserve"> PAGEREF _Toc243775796 \h </w:instrText>
             </w:r>
             <w:r>
               <w:rPr>
@@ -2293,7 +2293,7 @@
               <w:noProof/>
             </w:rPr>
           </w:pPr>
-          <w:hyperlink w:anchor="_Toc243775022" w:history="1">
+          <w:hyperlink w:anchor="_Toc243775797" w:history="1">
             <w:r>
               <w:rPr>
                 <w:rStyle w:val="Collegamentoipertestuale"/>
@@ -2317,7 +2317,7 @@
               <w:rPr>
                 <w:noProof/>
               </w:rPr>
-              <w:instrText xml:space="preserve"> PAGEREF _Toc243775022 \h </w:instrText>
+              <w:instrText xml:space="preserve"> PAGEREF _Toc243775797 \h </w:instrText>
             </w:r>
             <w:r>
               <w:rPr>
@@ -2354,7 +2354,7 @@
               <w:noProof/>
             </w:rPr>
           </w:pPr>
-          <w:hyperlink w:anchor="_Toc243775023" w:history="1">
+          <w:hyperlink w:anchor="_Toc243775798" w:history="1">
             <w:r>
               <w:rPr>
                 <w:rStyle w:val="Collegamentoipertestuale"/>
@@ -2378,7 +2378,7 @@
               <w:rPr>
                 <w:noProof/>
               </w:rPr>
-              <w:instrText xml:space="preserve"> PAGEREF _Toc243775023 \h </w:instrText>
+              <w:instrText xml:space="preserve"> PAGEREF _Toc243775798 \h </w:instrText>
             </w:r>
             <w:r>
               <w:rPr>
@@ -2415,7 +2415,7 @@
               <w:noProof/>
             </w:rPr>
           </w:pPr>
-          <w:hyperlink w:anchor="_Toc243775024" w:history="1">
+          <w:hyperlink w:anchor="_Toc243775799" w:history="1">
             <w:r>
               <w:rPr>
                 <w:rStyle w:val="Collegamentoipertestuale"/>
@@ -2439,7 +2439,7 @@
               <w:rPr>
                 <w:noProof/>
               </w:rPr>
-              <w:instrText xml:space="preserve"> PAGEREF _Toc243775024 \h </w:instrText>
+              <w:instrText xml:space="preserve"> PAGEREF _Toc243775799 \h </w:instrText>
             </w:r>
             <w:r>
               <w:rPr>
@@ -2476,7 +2476,7 @@
               <w:noProof/>
             </w:rPr>
           </w:pPr>
-          <w:hyperlink w:anchor="_Toc243775025" w:history="1">
+          <w:hyperlink w:anchor="_Toc243775800" w:history="1">
             <w:r>
               <w:rPr>
                 <w:rStyle w:val="Collegamentoipertestuale"/>
@@ -2500,7 +2500,7 @@
               <w:rPr>
                 <w:noProof/>
               </w:rPr>
-              <w:instrText xml:space="preserve"> PAGEREF _Toc243775025 \h </w:instrText>
+              <w:instrText xml:space="preserve"> PAGEREF _Toc243775800 \h </w:instrText>
             </w:r>
             <w:r>
               <w:rPr>
@@ -2537,7 +2537,7 @@
               <w:noProof/>
             </w:rPr>
           </w:pPr>
-          <w:hyperlink w:anchor="_Toc243775026" w:history="1">
+          <w:hyperlink w:anchor="_Toc243775801" w:history="1">
             <w:r>
               <w:rPr>
                 <w:rStyle w:val="Collegamentoipertestuale"/>
@@ -2561,7 +2561,7 @@
               <w:rPr>
                 <w:noProof/>
               </w:rPr>
-              <w:instrText xml:space="preserve"> PAGEREF _Toc243775026 \h </w:instrText>
+              <w:instrText xml:space="preserve"> PAGEREF _Toc243775801 \h </w:instrText>
             </w:r>
             <w:r>
               <w:rPr>
@@ -2598,7 +2598,7 @@
               <w:noProof/>
             </w:rPr>
           </w:pPr>
-          <w:hyperlink w:anchor="_Toc243775027" w:history="1">
+          <w:hyperlink w:anchor="_Toc243775802" w:history="1">
             <w:r>
               <w:rPr>
                 <w:rStyle w:val="Collegamentoipertestuale"/>
@@ -2622,7 +2622,7 @@
               <w:rPr>
                 <w:noProof/>
               </w:rPr>
-              <w:instrText xml:space="preserve"> PAGEREF _Toc243775027 \h </w:instrText>
+              <w:instrText xml:space="preserve"> PAGEREF _Toc243775802 \h </w:instrText>
             </w:r>
             <w:r>
               <w:rPr>
@@ -2659,7 +2659,7 @@
               <w:noProof/>
             </w:rPr>
           </w:pPr>
-          <w:hyperlink w:anchor="_Toc243775028" w:history="1">
+          <w:hyperlink w:anchor="_Toc243775803" w:history="1">
             <w:r>
               <w:rPr>
                 <w:rStyle w:val="Collegamentoipertestuale"/>
@@ -2683,7 +2683,7 @@
               <w:rPr>
                 <w:noProof/>
               </w:rPr>
-              <w:instrText xml:space="preserve"> PAGEREF _Toc243775028 \h </w:instrText>
+              <w:instrText xml:space="preserve"> PAGEREF _Toc243775803 \h </w:instrText>
             </w:r>
             <w:r>
               <w:rPr>
@@ -2720,7 +2720,7 @@
               <w:noProof/>
             </w:rPr>
           </w:pPr>
-          <w:hyperlink w:anchor="_Toc243775029" w:history="1">
+          <w:hyperlink w:anchor="_Toc243775804" w:history="1">
             <w:r>
               <w:rPr>
                 <w:rStyle w:val="Collegamentoipertestuale"/>
@@ -2744,7 +2744,7 @@
               <w:rPr>
                 <w:noProof/>
               </w:rPr>
-              <w:instrText xml:space="preserve"> PAGEREF _Toc243775029 \h </w:instrText>
+              <w:instrText xml:space="preserve"> PAGEREF _Toc243775804 \h </w:instrText>
             </w:r>
             <w:r>
               <w:rPr>
@@ -2781,7 +2781,7 @@
               <w:noProof/>
             </w:rPr>
           </w:pPr>
-          <w:hyperlink w:anchor="_Toc243775030" w:history="1">
+          <w:hyperlink w:anchor="_Toc243775805" w:history="1">
             <w:r>
               <w:rPr>
                 <w:rStyle w:val="Collegamentoipertestuale"/>
@@ -2805,7 +2805,7 @@
               <w:rPr>
                 <w:noProof/>
               </w:rPr>
-              <w:instrText xml:space="preserve"> PAGEREF _Toc243775030 \h </w:instrText>
+              <w:instrText xml:space="preserve"> PAGEREF _Toc243775805 \h </w:instrText>
             </w:r>
             <w:r>
               <w:rPr>
@@ -2842,7 +2842,7 @@
               <w:noProof/>
             </w:rPr>
           </w:pPr>
-          <w:hyperlink w:anchor="_Toc243775031" w:history="1">
+          <w:hyperlink w:anchor="_Toc243775806" w:history="1">
             <w:r>
               <w:rPr>
                 <w:rStyle w:val="Collegamentoipertestuale"/>
@@ -2866,7 +2866,7 @@
               <w:rPr>
                 <w:noProof/>
               </w:rPr>
-              <w:instrText xml:space="preserve"> PAGEREF _Toc243775031 \h </w:instrText>
+              <w:instrText xml:space="preserve"> PAGEREF _Toc243775806 \h </w:instrText>
             </w:r>
             <w:r>
               <w:rPr>
@@ -2903,7 +2903,7 @@
               <w:noProof/>
             </w:rPr>
           </w:pPr>
-          <w:hyperlink w:anchor="_Toc243775032" w:history="1">
+          <w:hyperlink w:anchor="_Toc243775807" w:history="1">
             <w:r>
               <w:rPr>
                 <w:rStyle w:val="Collegamentoipertestuale"/>
@@ -2927,7 +2927,7 @@
               <w:rPr>
                 <w:noProof/>
               </w:rPr>
-              <w:instrText xml:space="preserve"> PAGEREF _Toc243775032 \h </w:instrText>
+              <w:instrText xml:space="preserve"> PAGEREF _Toc243775807 \h </w:instrText>
             </w:r>
             <w:r>
               <w:rPr>
@@ -2964,7 +2964,7 @@
               <w:noProof/>
             </w:rPr>
           </w:pPr>
-          <w:hyperlink w:anchor="_Toc243775033" w:history="1">
+          <w:hyperlink w:anchor="_Toc243775808" w:history="1">
             <w:r>
               <w:rPr>
                 <w:rStyle w:val="Collegamentoipertestuale"/>
@@ -2988,7 +2988,7 @@
               <w:rPr>
                 <w:noProof/>
               </w:rPr>
-              <w:instrText xml:space="preserve"> PAGEREF _Toc243775033 \h </w:instrText>
+              <w:instrText xml:space="preserve"> PAGEREF _Toc243775808 \h </w:instrText>
             </w:r>
             <w:r>
               <w:rPr>
@@ -3025,7 +3025,7 @@
               <w:noProof/>
             </w:rPr>
           </w:pPr>
-          <w:hyperlink w:anchor="_Toc243775034" w:history="1">
+          <w:hyperlink w:anchor="_Toc243775809" w:history="1">
             <w:r>
               <w:rPr>
                 <w:rStyle w:val="Collegamentoipertestuale"/>
@@ -3049,7 +3049,7 @@
               <w:rPr>
                 <w:noProof/>
               </w:rPr>
-              <w:instrText xml:space="preserve"> PAGEREF _Toc243775034 \h </w:instrText>
+              <w:instrText xml:space="preserve"> PAGEREF _Toc243775809 \h </w:instrText>
             </w:r>
             <w:r>
               <w:rPr>
@@ -3086,7 +3086,7 @@
               <w:noProof/>
             </w:rPr>
           </w:pPr>
-          <w:hyperlink w:anchor="_Toc243775035" w:history="1">
+          <w:hyperlink w:anchor="_Toc243775810" w:history="1">
             <w:r>
               <w:rPr>
                 <w:rStyle w:val="Collegamentoipertestuale"/>
@@ -3110,7 +3110,7 @@
               <w:rPr>
                 <w:noProof/>
               </w:rPr>
-              <w:instrText xml:space="preserve"> PAGEREF _Toc243775035 \h </w:instrText>
+              <w:instrText xml:space="preserve"> PAGEREF _Toc243775810 \h </w:instrText>
             </w:r>
             <w:r>
               <w:rPr>
@@ -3147,7 +3147,7 @@
               <w:noProof/>
             </w:rPr>
           </w:pPr>
-          <w:hyperlink w:anchor="_Toc243775036" w:history="1">
+          <w:hyperlink w:anchor="_Toc243775811" w:history="1">
             <w:r>
               <w:rPr>
                 <w:rStyle w:val="Collegamentoipertestuale"/>
@@ -3171,7 +3171,7 @@
               <w:rPr>
                 <w:noProof/>
               </w:rPr>
-              <w:instrText xml:space="preserve"> PAGEREF _Toc243775036 \h </w:instrText>
+              <w:instrText xml:space="preserve"> PAGEREF _Toc243775811 \h </w:instrText>
             </w:r>
             <w:r>
               <w:rPr>
@@ -3208,7 +3208,7 @@
               <w:noProof/>
             </w:rPr>
           </w:pPr>
-          <w:hyperlink w:anchor="_Toc243775037" w:history="1">
+          <w:hyperlink w:anchor="_Toc243775812" w:history="1">
             <w:r>
               <w:rPr>
                 <w:rStyle w:val="Collegamentoipertestuale"/>
@@ -3232,7 +3232,7 @@
               <w:rPr>
                 <w:noProof/>
               </w:rPr>
-              <w:instrText xml:space="preserve"> PAGEREF _Toc243775037 \h </w:instrText>
+              <w:instrText xml:space="preserve"> PAGEREF _Toc243775812 \h </w:instrText>
             </w:r>
             <w:r>
               <w:rPr>
@@ -3275,7 +3275,7 @@
       <w:pPr>
         <w:pStyle w:val="Titolo1"/>
       </w:pPr>
-      <w:bookmarkStart w:id="0" w:name="_Toc243774987"/>
+      <w:bookmarkStart w:id="0" w:name="_Toc243775762"/>
       <w:r>
         <w:t>1. In breve</w:t>
       </w:r>
@@ -3616,7 +3616,7 @@
       <w:pPr>
         <w:pStyle w:val="Titolo1"/>
       </w:pPr>
-      <w:bookmarkStart w:id="1" w:name="_Toc243774988"/>
+      <w:bookmarkStart w:id="1" w:name="_Toc243775763"/>
       <w:r>
         <w:t>2. Nuovo marchio</w:t>
       </w:r>
@@ -3626,7 +3626,7 @@
       <w:pPr>
         <w:pStyle w:val="Titolo2"/>
       </w:pPr>
-      <w:bookmarkStart w:id="2" w:name="_Toc243774989"/>
+      <w:bookmarkStart w:id="2" w:name="_Toc243775764"/>
       <w:r>
         <w:t>2.1 Nomi e identificativi</w:t>
       </w:r>
@@ -4172,7 +4172,7 @@
       <w:pPr>
         <w:pStyle w:val="Titolo2"/>
       </w:pPr>
-      <w:bookmarkStart w:id="3" w:name="_Toc243774990"/>
+      <w:bookmarkStart w:id="3" w:name="_Toc243775765"/>
       <w:r>
         <w:t>2.2 Colori</w:t>
       </w:r>
@@ -4567,7 +4567,7 @@
       <w:pPr>
         <w:pStyle w:val="Titolo2"/>
       </w:pPr>
-      <w:bookmarkStart w:id="4" w:name="_Toc243774991"/>
+      <w:bookmarkStart w:id="4" w:name="_Toc243775766"/>
       <w:r>
         <w:t>2.3 Icona in uso: 24 «Foglio senza fondo» (serie 6, 22 ottobre)</w:t>
       </w:r>
@@ -4601,7 +4601,7 @@
           <w:noProof/>
         </w:rPr>
         <w:drawing>
-          <wp:inline distT="0" distB="0" distL="0" distR="0" wp14:anchorId="00CC45BC" wp14:editId="379BEB9A">
+          <wp:inline distT="0" distB="0" distL="0" distR="0" wp14:anchorId="5946C6BD" wp14:editId="0B431362">
             <wp:extent cx="3429000" cy="4000500"/>
             <wp:effectExtent l="0" t="0" r="0" b="0"/>
             <wp:docPr id="2" name="Immagine 2"/>
@@ -4660,7 +4660,7 @@
       <w:pPr>
         <w:pStyle w:val="Titolo2"/>
       </w:pPr>
-      <w:bookmarkStart w:id="5" w:name="_Toc243774992"/>
+      <w:bookmarkStart w:id="5" w:name="_Toc243775767"/>
       <w:r>
         <w:t>2.4 Serie 4: la 17 «Foglio oro», in uso fino al 21 ottobre</w:t>
       </w:r>
@@ -4694,7 +4694,7 @@
           <w:noProof/>
         </w:rPr>
         <w:drawing>
-          <wp:inline distT="0" distB="0" distL="0" distR="0" wp14:anchorId="73AA5686" wp14:editId="68C64757">
+          <wp:inline distT="0" distB="0" distL="0" distR="0" wp14:anchorId="274B5E76" wp14:editId="11738FC4">
             <wp:extent cx="5334000" cy="5895975"/>
             <wp:effectExtent l="0" t="0" r="0" b="0"/>
             <wp:docPr id="3" name="Immagine 3"/>
@@ -5107,7 +5107,7 @@
       <w:pPr>
         <w:pStyle w:val="Titolo2"/>
       </w:pPr>
-      <w:bookmarkStart w:id="6" w:name="_Toc243774993"/>
+      <w:bookmarkStart w:id="6" w:name="_Toc243775768"/>
       <w:r>
         <w:t>2.5 Serie 5: la 17 con più bianco, la 19 in uso il 21 ottobre</w:t>
       </w:r>
@@ -5141,7 +5141,7 @@
           <w:noProof/>
         </w:rPr>
         <w:drawing>
-          <wp:inline distT="0" distB="0" distL="0" distR="0" wp14:anchorId="19ABCDC4" wp14:editId="6F01A706">
+          <wp:inline distT="0" distB="0" distL="0" distR="0" wp14:anchorId="195EFCD7" wp14:editId="6C168524">
             <wp:extent cx="5715000" cy="3295650"/>
             <wp:effectExtent l="0" t="0" r="0" b="0"/>
             <wp:docPr id="4" name="Immagine 4"/>
@@ -5688,7 +5688,7 @@
       <w:pPr>
         <w:pStyle w:val="Titolo2"/>
       </w:pPr>
-      <w:bookmarkStart w:id="7" w:name="_Toc243774994"/>
+      <w:bookmarkStart w:id="7" w:name="_Toc243775769"/>
       <w:r>
         <w:t>2.6 Serie 3, non scelta (la 11 è diventata la serie 4)</w:t>
       </w:r>
@@ -5712,7 +5712,7 @@
           <w:noProof/>
         </w:rPr>
         <w:drawing>
-          <wp:inline distT="0" distB="0" distL="0" distR="0" wp14:anchorId="2D7194AE" wp14:editId="7961A8A8">
+          <wp:inline distT="0" distB="0" distL="0" distR="0" wp14:anchorId="36FEA965" wp14:editId="62B55025">
             <wp:extent cx="5905500" cy="4133850"/>
             <wp:effectExtent l="0" t="0" r="0" b="0"/>
             <wp:docPr id="5" name="Immagine 5"/>
@@ -6398,7 +6398,7 @@
       <w:pPr>
         <w:pStyle w:val="Titolo2"/>
       </w:pPr>
-      <w:bookmarkStart w:id="8" w:name="_Toc243774995"/>
+      <w:bookmarkStart w:id="8" w:name="_Toc243775770"/>
       <w:r>
         <w:t>2.7 Serie 2, non scelta</w:t>
       </w:r>
@@ -6422,7 +6422,7 @@
           <w:noProof/>
         </w:rPr>
         <w:drawing>
-          <wp:inline distT="0" distB="0" distL="0" distR="0" wp14:anchorId="32901FE1" wp14:editId="5E23D57A">
+          <wp:inline distT="0" distB="0" distL="0" distR="0" wp14:anchorId="60D08E14" wp14:editId="3BE79206">
             <wp:extent cx="5905500" cy="4133850"/>
             <wp:effectExtent l="0" t="0" r="0" b="0"/>
             <wp:docPr id="6" name="Immagine 6"/>
@@ -7142,7 +7142,7 @@
       <w:pPr>
         <w:pStyle w:val="Titolo2"/>
       </w:pPr>
-      <w:bookmarkStart w:id="9" w:name="_Toc243774996"/>
+      <w:bookmarkStart w:id="9" w:name="_Toc243775771"/>
       <w:r>
         <w:t>2.8 Serie 1, scartata</w:t>
       </w:r>
@@ -7166,7 +7166,7 @@
           <w:noProof/>
         </w:rPr>
         <w:drawing>
-          <wp:inline distT="0" distB="0" distL="0" distR="0" wp14:anchorId="1FC181E3" wp14:editId="5DA0AFC3">
+          <wp:inline distT="0" distB="0" distL="0" distR="0" wp14:anchorId="3DD9B437" wp14:editId="63E3791F">
             <wp:extent cx="4000500" cy="2800350"/>
             <wp:effectExtent l="0" t="0" r="0" b="0"/>
             <wp:docPr id="7" name="Immagine 7"/>
@@ -7225,7 +7225,7 @@
       <w:pPr>
         <w:pStyle w:val="Titolo2"/>
       </w:pPr>
-      <w:bookmarkStart w:id="10" w:name="_Toc243774997"/>
+      <w:bookmarkStart w:id="10" w:name="_Toc243775772"/>
       <w:r>
         <w:t>2.9 Verifica dei marchi registrati</w:t>
       </w:r>
@@ -7477,7 +7477,7 @@
       <w:pPr>
         <w:pStyle w:val="Titolo1"/>
       </w:pPr>
-      <w:bookmarkStart w:id="11" w:name="_Toc243774998"/>
+      <w:bookmarkStart w:id="11" w:name="_Toc243775773"/>
       <w:r>
         <w:t>3. Temi colore</w:t>
       </w:r>
@@ -7511,7 +7511,7 @@
           <w:noProof/>
         </w:rPr>
         <w:drawing>
-          <wp:inline distT="0" distB="0" distL="0" distR="0" wp14:anchorId="7883C4EC" wp14:editId="72267FF3">
+          <wp:inline distT="0" distB="0" distL="0" distR="0" wp14:anchorId="28AA7D9E" wp14:editId="2FA1EAB2">
             <wp:extent cx="4572000" cy="3429000"/>
             <wp:effectExtent l="0" t="0" r="0" b="0"/>
             <wp:docPr id="8" name="Immagine 8"/>
@@ -8221,7 +8221,7 @@
       <w:pPr>
         <w:pStyle w:val="Titolo1"/>
       </w:pPr>
-      <w:bookmarkStart w:id="12" w:name="_Toc243774999"/>
+      <w:bookmarkStart w:id="12" w:name="_Toc243775774"/>
       <w:r>
         <w:t>4. Correzione: avvisi «come JavaScript»</w:t>
       </w:r>
@@ -8231,7 +8231,7 @@
       <w:pPr>
         <w:pStyle w:val="Titolo2"/>
       </w:pPr>
-      <w:bookmarkStart w:id="13" w:name="_Toc243775000"/>
+      <w:bookmarkStart w:id="13" w:name="_Toc243775775"/>
       <w:r>
         <w:t>4.1 Il problema</w:t>
       </w:r>
@@ -8634,7 +8634,7 @@
       <w:pPr>
         <w:pStyle w:val="Titolo2"/>
       </w:pPr>
-      <w:bookmarkStart w:id="14" w:name="_Toc243775001"/>
+      <w:bookmarkStart w:id="14" w:name="_Toc243775776"/>
       <w:r>
         <w:t>4.2 La soluzione</w:t>
       </w:r>
@@ -8767,7 +8767,7 @@
           <w:noProof/>
         </w:rPr>
         <w:drawing>
-          <wp:inline distT="0" distB="0" distL="0" distR="0" wp14:anchorId="4A0794F9" wp14:editId="1FEAEC80">
+          <wp:inline distT="0" distB="0" distL="0" distR="0" wp14:anchorId="71B56F66" wp14:editId="587F99DC">
             <wp:extent cx="4572000" cy="3429000"/>
             <wp:effectExtent l="0" t="0" r="0" b="0"/>
             <wp:docPr id="9" name="Immagine 9"/>
@@ -8826,7 +8826,7 @@
       <w:pPr>
         <w:pStyle w:val="Titolo2"/>
       </w:pPr>
-      <w:bookmarkStart w:id="15" w:name="_Toc243775002"/>
+      <w:bookmarkStart w:id="15" w:name="_Toc243775777"/>
       <w:r>
         <w:t>4.3 Verifiche</w:t>
       </w:r>
@@ -8873,7 +8873,7 @@
       <w:pPr>
         <w:pStyle w:val="Titolo2"/>
       </w:pPr>
-      <w:bookmarkStart w:id="16" w:name="_Toc243775003"/>
+      <w:bookmarkStart w:id="16" w:name="_Toc243775778"/>
       <w:r>
         <w:t>4.4 Android: menu Tema e notifiche (versione 1.0.1)</w:t>
       </w:r>
@@ -9208,7 +9208,7 @@
       <w:pPr>
         <w:pStyle w:val="Titolo2"/>
       </w:pPr>
-      <w:bookmarkStart w:id="17" w:name="_Toc243775004"/>
+      <w:bookmarkStart w:id="17" w:name="_Toc243775779"/>
       <w:r>
         <w:t>4.5 App più leggera: traduzione tolta</w:t>
       </w:r>
@@ -9641,7 +9641,7 @@
       <w:pPr>
         <w:pStyle w:val="Titolo2"/>
       </w:pPr>
-      <w:bookmarkStart w:id="18" w:name="_Toc243775005"/>
+      <w:bookmarkStart w:id="18" w:name="_Toc243775780"/>
       <w:r>
         <w:t>4.6 Schede in una nuova finestra</w:t>
       </w:r>
@@ -9759,7 +9759,7 @@
           <w:noProof/>
         </w:rPr>
         <w:drawing>
-          <wp:inline distT="0" distB="0" distL="0" distR="0" wp14:anchorId="127FAE63" wp14:editId="4751D52B">
+          <wp:inline distT="0" distB="0" distL="0" distR="0" wp14:anchorId="323E65DD" wp14:editId="1ED69A11">
             <wp:extent cx="5715000" cy="857250"/>
             <wp:effectExtent l="0" t="0" r="0" b="0"/>
             <wp:docPr id="10" name="Immagine 10"/>
@@ -10048,7 +10048,7 @@
       <w:pPr>
         <w:pStyle w:val="Titolo2"/>
       </w:pPr>
-      <w:bookmarkStart w:id="19" w:name="_Toc243775006"/>
+      <w:bookmarkStart w:id="19" w:name="_Toc243775781"/>
       <w:r>
         <w:t>4.7 Riunire le finestre</w:t>
       </w:r>
@@ -10150,7 +10150,7 @@
       <w:pPr>
         <w:pStyle w:val="Titolo2"/>
       </w:pPr>
-      <w:bookmarkStart w:id="20" w:name="_Toc243775007"/>
+      <w:bookmarkStart w:id="20" w:name="_Toc243775782"/>
       <w:r>
         <w:t>4.8 Correzioni di «Modifica testo»</w:t>
       </w:r>
@@ -10415,7 +10415,7 @@
           <w:noProof/>
         </w:rPr>
         <w:drawing>
-          <wp:inline distT="0" distB="0" distL="0" distR="0" wp14:anchorId="296BBE38" wp14:editId="256D3DE4">
+          <wp:inline distT="0" distB="0" distL="0" distR="0" wp14:anchorId="29E13C4B" wp14:editId="40D2D2FA">
             <wp:extent cx="3286125" cy="2286000"/>
             <wp:effectExtent l="0" t="0" r="0" b="0"/>
             <wp:docPr id="11" name="Immagine 11"/>
@@ -10480,7 +10480,7 @@
           <w:noProof/>
         </w:rPr>
         <w:drawing>
-          <wp:inline distT="0" distB="0" distL="0" distR="0" wp14:anchorId="6AEC1B9B" wp14:editId="7EEC09F5">
+          <wp:inline distT="0" distB="0" distL="0" distR="0" wp14:anchorId="72F49077" wp14:editId="2B5728A8">
             <wp:extent cx="3286125" cy="2286000"/>
             <wp:effectExtent l="0" t="0" r="0" b="0"/>
             <wp:docPr id="12" name="Immagine 12"/>
@@ -10547,7 +10547,7 @@
       <w:pPr>
         <w:pStyle w:val="Titolo2"/>
       </w:pPr>
-      <w:bookmarkStart w:id="21" w:name="_Toc243775008"/>
+      <w:bookmarkStart w:id="21" w:name="_Toc243775783"/>
       <w:r>
         <w:t>4.9 Web app per iPhone</w:t>
       </w:r>
@@ -10986,7 +10986,7 @@
       <w:pPr>
         <w:pStyle w:val="Titolo2"/>
       </w:pPr>
-      <w:bookmarkStart w:id="22" w:name="_Toc243775009"/>
+      <w:bookmarkStart w:id="22" w:name="_Toc243775784"/>
       <w:r>
         <w:t>4.10 Aggiornamenti su Cloudflare (repository privato)</w:t>
       </w:r>
@@ -11500,7 +11500,7 @@
       <w:pPr>
         <w:pStyle w:val="Titolo2"/>
       </w:pPr>
-      <w:bookmarkStart w:id="23" w:name="_Toc243775010"/>
+      <w:bookmarkStart w:id="23" w:name="_Toc243775785"/>
       <w:r>
         <w:t>4.11 Eliminare firme, timbri e testi già applicati (versione 1.4.0)</w:t>
       </w:r>
@@ -11831,7 +11831,7 @@
           <w:noProof/>
         </w:rPr>
         <w:drawing>
-          <wp:inline distT="0" distB="0" distL="0" distR="0" wp14:anchorId="4046F790" wp14:editId="7D941704">
+          <wp:inline distT="0" distB="0" distL="0" distR="0" wp14:anchorId="49BF7F96" wp14:editId="528E6D11">
             <wp:extent cx="2095500" cy="4533900"/>
             <wp:effectExtent l="0" t="0" r="0" b="0"/>
             <wp:docPr id="13" name="Immagine 13"/>
@@ -11928,7 +11928,7 @@
       <w:pPr>
         <w:pStyle w:val="Titolo2"/>
       </w:pPr>
-      <w:bookmarkStart w:id="24" w:name="_Toc243775011"/>
+      <w:bookmarkStart w:id="24" w:name="_Toc243775786"/>
       <w:r>
         <w:t>4.12 Telefono: pannello più grande e caselle di testo comode (versione 1.4.0)</w:t>
       </w:r>
@@ -11996,7 +11996,7 @@
           <w:noProof/>
         </w:rPr>
         <w:drawing>
-          <wp:inline distT="0" distB="0" distL="0" distR="0" wp14:anchorId="3543EE23" wp14:editId="0A138DF5">
+          <wp:inline distT="0" distB="0" distL="0" distR="0" wp14:anchorId="3CFAFB45" wp14:editId="03865498">
             <wp:extent cx="2095500" cy="4533900"/>
             <wp:effectExtent l="0" t="0" r="0" b="0"/>
             <wp:docPr id="14" name="Immagine 14"/>
@@ -12061,7 +12061,7 @@
           <w:noProof/>
         </w:rPr>
         <w:drawing>
-          <wp:inline distT="0" distB="0" distL="0" distR="0" wp14:anchorId="2B39B04B" wp14:editId="5F2D013D">
+          <wp:inline distT="0" distB="0" distL="0" distR="0" wp14:anchorId="53680C7B" wp14:editId="59B3AC8A">
             <wp:extent cx="2095500" cy="4533900"/>
             <wp:effectExtent l="0" t="0" r="0" b="0"/>
             <wp:docPr id="15" name="Immagine 15"/>
@@ -12120,7 +12120,7 @@
       <w:pPr>
         <w:pStyle w:val="Titolo1"/>
       </w:pPr>
-      <w:bookmarkStart w:id="25" w:name="_Toc243775012"/>
+      <w:bookmarkStart w:id="25" w:name="_Toc243775787"/>
       <w:r>
         <w:t>5. Decisioni</w:t>
       </w:r>
@@ -12138,7 +12138,7 @@
       <w:pPr>
         <w:pStyle w:val="Titolo2"/>
       </w:pPr>
-      <w:bookmarkStart w:id="26" w:name="_Toc243775013"/>
+      <w:bookmarkStart w:id="26" w:name="_Toc243775788"/>
       <w:r>
         <w:t>5.1 Canale degli aggiornamenti</w:t>
       </w:r>
@@ -12645,7 +12645,7 @@
       <w:pPr>
         <w:pStyle w:val="Titolo2"/>
       </w:pPr>
-      <w:bookmarkStart w:id="27" w:name="_Toc243775014"/>
+      <w:bookmarkStart w:id="27" w:name="_Toc243775789"/>
       <w:r>
         <w:t>5.2 Storia del repository</w:t>
       </w:r>
@@ -13152,7 +13152,7 @@
       <w:pPr>
         <w:pStyle w:val="Titolo2"/>
       </w:pPr>
-      <w:bookmarkStart w:id="28" w:name="_Toc243775015"/>
+      <w:bookmarkStart w:id="28" w:name="_Toc243775790"/>
       <w:r>
         <w:t>5.3 Identificativi del prodotto</w:t>
       </w:r>
@@ -13652,7 +13652,7 @@
       <w:pPr>
         <w:pStyle w:val="Titolo2"/>
       </w:pPr>
-      <w:bookmarkStart w:id="29" w:name="_Toc243775016"/>
+      <w:bookmarkStart w:id="29" w:name="_Toc243775791"/>
       <w:r>
         <w:t>5.4 Avvisi e domande</w:t>
       </w:r>
@@ -14159,7 +14159,7 @@
       <w:pPr>
         <w:pStyle w:val="Titolo2"/>
       </w:pPr>
-      <w:bookmarkStart w:id="30" w:name="_Toc243775017"/>
+      <w:bookmarkStart w:id="30" w:name="_Toc243775792"/>
       <w:r>
         <w:t>5.5 Traduzione offline</w:t>
       </w:r>
@@ -14666,7 +14666,7 @@
       <w:pPr>
         <w:pStyle w:val="Titolo2"/>
       </w:pPr>
-      <w:bookmarkStart w:id="31" w:name="_Toc243775018"/>
+      <w:bookmarkStart w:id="31" w:name="_Toc243775793"/>
       <w:r>
         <w:t>5.6 Passaggio della scheda alla nuova finestra</w:t>
       </w:r>
@@ -15188,7 +15188,7 @@
       <w:pPr>
         <w:pStyle w:val="Titolo2"/>
       </w:pPr>
-      <w:bookmarkStart w:id="32" w:name="_Toc243775019"/>
+      <w:bookmarkStart w:id="32" w:name="_Toc243775794"/>
       <w:r>
         <w:t>5.7 Come si cancella la riga in «Modifica testo»</w:t>
       </w:r>
@@ -15695,7 +15695,7 @@
       <w:pPr>
         <w:pStyle w:val="Titolo2"/>
       </w:pPr>
-      <w:bookmarkStart w:id="33" w:name="_Toc243775020"/>
+      <w:bookmarkStart w:id="33" w:name="_Toc243775795"/>
       <w:r>
         <w:t>5.8 Come si ritrovano firme e timbri applicati</w:t>
       </w:r>
@@ -16232,7 +16232,7 @@
       <w:pPr>
         <w:pStyle w:val="Titolo1"/>
       </w:pPr>
-      <w:bookmarkStart w:id="34" w:name="_Toc243775021"/>
+      <w:bookmarkStart w:id="34" w:name="_Toc243775796"/>
       <w:r>
         <w:t>6. Come si lavora</w:t>
       </w:r>
@@ -16242,7 +16242,7 @@
       <w:pPr>
         <w:pStyle w:val="Titolo2"/>
       </w:pPr>
-      <w:bookmarkStart w:id="35" w:name="_Toc243775022"/>
+      <w:bookmarkStart w:id="35" w:name="_Toc243775797"/>
       <w:r>
         <w:t>6.1 Comandi</w:t>
       </w:r>
@@ -16312,7 +16312,7 @@
       <w:pPr>
         <w:pStyle w:val="Titolo2"/>
       </w:pPr>
-      <w:bookmarkStart w:id="36" w:name="_Toc243775023"/>
+      <w:bookmarkStart w:id="36" w:name="_Toc243775798"/>
       <w:r>
         <w:t>6.2 Pubblicare una versione</w:t>
       </w:r>
@@ -16440,7 +16440,7 @@
       <w:pPr>
         <w:pStyle w:val="Titolo2"/>
       </w:pPr>
-      <w:bookmarkStart w:id="37" w:name="_Toc243775024"/>
+      <w:bookmarkStart w:id="37" w:name="_Toc243775799"/>
       <w:r>
         <w:t>6.3 Release 1.0.0 (pubblicata il 16 ottobre 2026)</w:t>
       </w:r>
@@ -17167,7 +17167,7 @@
       <w:pPr>
         <w:pStyle w:val="Titolo2"/>
       </w:pPr>
-      <w:bookmarkStart w:id="38" w:name="_Toc243775025"/>
+      <w:bookmarkStart w:id="38" w:name="_Toc243775800"/>
       <w:r>
         <w:t>6.4 Release 1.0.1</w:t>
       </w:r>
@@ -17464,7 +17464,7 @@
       <w:pPr>
         <w:pStyle w:val="Titolo2"/>
       </w:pPr>
-      <w:bookmarkStart w:id="39" w:name="_Toc243775026"/>
+      <w:bookmarkStart w:id="39" w:name="_Toc243775801"/>
       <w:r>
         <w:t>6.5 Release 1.0.2 e repository pubblico</w:t>
       </w:r>
@@ -17886,7 +17886,7 @@
       <w:pPr>
         <w:pStyle w:val="Titolo2"/>
       </w:pPr>
-      <w:bookmarkStart w:id="40" w:name="_Toc243775027"/>
+      <w:bookmarkStart w:id="40" w:name="_Toc243775802"/>
       <w:r>
         <w:t>6.6 Nuova versione: link diretto per ogni sistema</w:t>
       </w:r>
@@ -18303,7 +18303,7 @@
           <w:noProof/>
         </w:rPr>
         <w:drawing>
-          <wp:inline distT="0" distB="0" distL="0" distR="0" wp14:anchorId="5C9572C0" wp14:editId="6C6017AC">
+          <wp:inline distT="0" distB="0" distL="0" distR="0" wp14:anchorId="5CEF0C83" wp14:editId="59BFEA62">
             <wp:extent cx="4572000" cy="4429125"/>
             <wp:effectExtent l="0" t="0" r="0" b="0"/>
             <wp:docPr id="16" name="Immagine 16"/>
@@ -18378,7 +18378,7 @@
       <w:pPr>
         <w:pStyle w:val="Titolo2"/>
       </w:pPr>
-      <w:bookmarkStart w:id="41" w:name="_Toc243775028"/>
+      <w:bookmarkStart w:id="41" w:name="_Toc243775803"/>
       <w:r>
         <w:t>6.7 Release 1.1.0</w:t>
       </w:r>
@@ -18942,7 +18942,7 @@
       <w:pPr>
         <w:pStyle w:val="Titolo2"/>
       </w:pPr>
-      <w:bookmarkStart w:id="42" w:name="_Toc243775029"/>
+      <w:bookmarkStart w:id="42" w:name="_Toc243775804"/>
       <w:r>
         <w:t>6.8 Versione 1.2.0</w:t>
       </w:r>
@@ -19491,7 +19491,7 @@
       <w:pPr>
         <w:pStyle w:val="Titolo2"/>
       </w:pPr>
-      <w:bookmarkStart w:id="43" w:name="_Toc243775030"/>
+      <w:bookmarkStart w:id="43" w:name="_Toc243775805"/>
       <w:r>
         <w:t>6.9 Versione 1.2.1</w:t>
       </w:r>
@@ -19509,7 +19509,7 @@
       <w:pPr>
         <w:pStyle w:val="Titolo2"/>
       </w:pPr>
-      <w:bookmarkStart w:id="44" w:name="_Toc243775031"/>
+      <w:bookmarkStart w:id="44" w:name="_Toc243775806"/>
       <w:r>
         <w:t>6.10 Versione 1.3.0</w:t>
       </w:r>
@@ -19541,7 +19541,7 @@
       <w:pPr>
         <w:pStyle w:val="Titolo2"/>
       </w:pPr>
-      <w:bookmarkStart w:id="45" w:name="_Toc243775032"/>
+      <w:bookmarkStart w:id="45" w:name="_Toc243775807"/>
       <w:r>
         <w:t>6.11 Versione 1.3.1 (ponte verso Cloudflare)</w:t>
       </w:r>
@@ -19559,7 +19559,7 @@
       <w:pPr>
         <w:pStyle w:val="Titolo2"/>
       </w:pPr>
-      <w:bookmarkStart w:id="46" w:name="_Toc243775033"/>
+      <w:bookmarkStart w:id="46" w:name="_Toc243775808"/>
       <w:r>
         <w:t>6.12 Versione 1.4.0</w:t>
       </w:r>
@@ -19570,14 +19570,14 @@
         <w:spacing w:after="120"/>
       </w:pPr>
       <w:r>
-        <w:t>Preparata il 24 ottobre 2026 (installer Windows 101.4.0, Android 1001004000): oggetti applicati eliminabili, firme digitali eliminabili una per volta, pannello ingrandibile e caselle di testo grandi sul telefono. Prima versione pubblicata dopo la versione ponte: gli aggiornamenti arrivano dal sito https://pdfz.pages.dev/.</w:t>
+        <w:t>Pubblicata il 24 ottobre 2026 (release in 7 minuti, sito Cloudflare aggiornato da solo 2 minuti dopo; installer Windows 101.4.0, Android 1001004000): oggetti applicati eliminabili, firme digitali eliminabili una per volta, pannello ingrandibile e caselle di testo grandi sul telefono. Prima versione pubblicata dopo la versione ponte: gli aggiornamenti arrivano dal sito https://pdfz.pages.dev/.</w:t>
       </w:r>
     </w:p>
     <w:p>
       <w:pPr>
         <w:pStyle w:val="Titolo2"/>
       </w:pPr>
-      <w:bookmarkStart w:id="47" w:name="_Toc243775034"/>
+      <w:bookmarkStart w:id="47" w:name="_Toc243775809"/>
       <w:r>
         <w:t>6.13 Ruoli</w:t>
       </w:r>
@@ -19850,7 +19850,7 @@
       <w:pPr>
         <w:pStyle w:val="Titolo1"/>
       </w:pPr>
-      <w:bookmarkStart w:id="48" w:name="_Toc243775035"/>
+      <w:bookmarkStart w:id="48" w:name="_Toc243775810"/>
       <w:r>
         <w:t>7. Sicurezza</w:t>
       </w:r>
@@ -20149,7 +20149,7 @@
       <w:pPr>
         <w:pStyle w:val="Titolo1"/>
       </w:pPr>
-      <w:bookmarkStart w:id="49" w:name="_Toc243775036"/>
+      <w:bookmarkStart w:id="49" w:name="_Toc243775811"/>
       <w:r>
         <w:t>8. Punti aperti</w:t>
       </w:r>
@@ -20418,7 +20418,7 @@
       <w:pPr>
         <w:pStyle w:val="Titolo1"/>
       </w:pPr>
-      <w:bookmarkStart w:id="50" w:name="_Toc243775037"/>
+      <w:bookmarkStart w:id="50" w:name="_Toc243775812"/>
       <w:r>
         <w:t>9. Pensato per i prossimi 10 anni</w:t>
       </w:r>
@@ -20738,64 +20738,150 @@
 <file path=word/numbering.xml><?xml version="1.0" encoding="utf-8"?>
 <w:numbering xmlns:wpc="http://schemas.microsoft.com/office/word/2010/wordprocessingCanvas" xmlns:cx="http://schemas.microsoft.com/office/drawing/2014/chartex" xmlns:cx1="http://schemas.microsoft.com/office/drawing/2015/9/8/chartex" xmlns:cx2="http://schemas.microsoft.com/office/drawing/2015/10/21/chartex" xmlns:cx3="http://schemas.microsoft.com/office/drawing/2016/5/9/chartex" xmlns:cx4="http://schemas.microsoft.com/office/drawing/2016/5/10/chartex" xmlns:cx5="http://schemas.microsoft.com/office/drawing/2016/5/11/chartex" xmlns:cx6="http://schemas.microsoft.com/office/drawing/2016/5/12/chartex" xmlns:cx7="http://schemas.microsoft.com/office/drawing/2016/5/13/chartex" xmlns:cx8="http://schemas.microsoft.com/office/drawing/2016/5/14/chartex" xmlns:mc="http://schemas.openxmlformats.org/markup-compatibility/2006" xmlns:aink="http://schemas.microsoft.com/office/drawing/2016/ink" xmlns:am3d="http://schemas.microsoft.com/office/drawing/2017/model3d" xmlns:o="urn:schemas-microsoft-com:office:office" xmlns:oel="http://schemas.microsoft.com/office/2019/extlst" xmlns:r="http://schemas.openxmlformats.org/officeDocument/2006/relationships" xmlns:m="http://schemas.openxmlformats.org/officeDocument/2006/math" xmlns:v="urn:schemas-microsoft-com:vml" xmlns:wp14="http://schemas.microsoft.com/office/word/2010/wordprocessingDrawing" xmlns:wp="http://schemas.openxmlformats.org/drawingml/2006/wordprocessingDrawing" xmlns:w10="urn:schemas-microsoft-com:office:word" xmlns:w="http://schemas.openxmlformats.org/wordprocessingml/2006/main" xmlns:w14="http://schemas.microsoft.com/office/word/2010/wordml" xmlns:w15="http://schemas.microsoft.com/office/word/2012/wordml" xmlns:w16cex="http://schemas.microsoft.com/office/word/2018/wordml/cex" xmlns:w16cid="http://schemas.microsoft.com/office/word/2016/wordml/cid" xmlns:w16="http://schemas.microsoft.com/office/word/2018/wordml" xmlns:w16du="http://schemas.microsoft.com/office/word/2023/wordml/word16du" xmlns:w16sdtdh="http://schemas.microsoft.com/office/word/2020/wordml/sdtdatahash" xmlns:w16sdtfl="http://schemas.microsoft.com/office/word/2024/wordml/sdtformatlock" xmlns:w16se="http://schemas.microsoft.com/office/word/2015/wordml/symex" xmlns:wpg="http://schemas.microsoft.com/office/word/2010/wordprocessingGroup" xmlns:wpi="http://schemas.microsoft.com/office/word/2010/wordprocessingInk" xmlns:wne="http://schemas.microsoft.com/office/word/2006/wordml" xmlns:wps="http://schemas.microsoft.com/office/word/2010/wordprocessingShape" mc:Ignorable="w14 w15 w16se w16cid w16 w16cex w16sdtdh w16sdtfl w16du wp14">
   <w:abstractNum w:abstractNumId="0" w15:restartNumberingAfterBreak="0">
-    <w:nsid w:val="0DE9590A"/>
+    <w:nsid w:val="114E7DC1"/>
     <w:multiLevelType w:val="hybridMultilevel"/>
-    <w:tmpl w:val="45566A22"/>
-    <w:lvl w:ilvl="0" w:tplc="2F58CD90">
+    <w:tmpl w:val="441E9710"/>
+    <w:lvl w:ilvl="0" w:tplc="B5505358">
       <w:start w:val="1"/>
-      <w:numFmt w:val="decimal"/>
-      <w:lvlText w:val="%1."/>
+      <w:numFmt w:val="bullet"/>
+      <w:lvlText w:val="•"/>
       <w:lvlJc w:val="left"/>
       <w:pPr>
-        <w:ind w:left="540" w:hanging="300"/>
+        <w:ind w:left="540" w:hanging="270"/>
       </w:pPr>
     </w:lvl>
-    <w:lvl w:ilvl="1" w:tplc="A5121ED0">
+    <w:lvl w:ilvl="1" w:tplc="DF509320">
       <w:numFmt w:val="decimal"/>
       <w:lvlText w:val=""/>
       <w:lvlJc w:val="left"/>
     </w:lvl>
-    <w:lvl w:ilvl="2" w:tplc="63B0D1B0">
+    <w:lvl w:ilvl="2" w:tplc="A976C000">
       <w:numFmt w:val="decimal"/>
       <w:lvlText w:val=""/>
       <w:lvlJc w:val="left"/>
     </w:lvl>
-    <w:lvl w:ilvl="3" w:tplc="C9DEE54A">
+    <w:lvl w:ilvl="3" w:tplc="381C0686">
       <w:numFmt w:val="decimal"/>
       <w:lvlText w:val=""/>
       <w:lvlJc w:val="left"/>
     </w:lvl>
-    <w:lvl w:ilvl="4" w:tplc="DA6E3C10">
+    <w:lvl w:ilvl="4" w:tplc="937C6AB4">
       <w:numFmt w:val="decimal"/>
       <w:lvlText w:val=""/>
       <w:lvlJc w:val="left"/>
     </w:lvl>
-    <w:lvl w:ilvl="5" w:tplc="88F828BA">
+    <w:lvl w:ilvl="5" w:tplc="F5A8C8F2">
       <w:numFmt w:val="decimal"/>
       <w:lvlText w:val=""/>
       <w:lvlJc w:val="left"/>
     </w:lvl>
-    <w:lvl w:ilvl="6" w:tplc="B13E12A0">
+    <w:lvl w:ilvl="6" w:tplc="8E3E84B4">
       <w:numFmt w:val="decimal"/>
       <w:lvlText w:val=""/>
       <w:lvlJc w:val="left"/>
     </w:lvl>
-    <w:lvl w:ilvl="7" w:tplc="EF565042">
+    <w:lvl w:ilvl="7" w:tplc="6A54B7BC">
       <w:numFmt w:val="decimal"/>
       <w:lvlText w:val=""/>
       <w:lvlJc w:val="left"/>
     </w:lvl>
-    <w:lvl w:ilvl="8" w:tplc="7A8E0364">
+    <w:lvl w:ilvl="8" w:tplc="48B22254">
       <w:numFmt w:val="decimal"/>
       <w:lvlText w:val=""/>
       <w:lvlJc w:val="left"/>
     </w:lvl>
   </w:abstractNum>
   <w:abstractNum w:abstractNumId="1" w15:restartNumberingAfterBreak="0">
-    <w:nsid w:val="3F6F4C6B"/>
+    <w:nsid w:val="147A4A03"/>
     <w:multiLevelType w:val="hybridMultilevel"/>
-    <w:tmpl w:val="C7C8D1C6"/>
-    <w:lvl w:ilvl="0" w:tplc="1F0C589C">
+    <w:tmpl w:val="246483F6"/>
+    <w:lvl w:ilvl="0" w:tplc="01162052" w:tentative="1">
+      <w:start w:val="1"/>
+      <w:numFmt w:val="bullet"/>
+      <w:lvlText w:val="●"/>
+      <w:lvlJc w:val="left"/>
+      <w:pPr>
+        <w:ind w:left="720" w:hanging="360"/>
+      </w:pPr>
+    </w:lvl>
+    <w:lvl w:ilvl="1" w:tplc="35CAEF22" w:tentative="1">
+      <w:start w:val="1"/>
+      <w:numFmt w:val="bullet"/>
+      <w:lvlText w:val="○"/>
+      <w:lvlJc w:val="left"/>
+      <w:pPr>
+        <w:ind w:left="1440" w:hanging="360"/>
+      </w:pPr>
+    </w:lvl>
+    <w:lvl w:ilvl="2" w:tplc="98A0C77E" w:tentative="1">
+      <w:start w:val="1"/>
+      <w:numFmt w:val="bullet"/>
+      <w:lvlText w:val="■"/>
+      <w:lvlJc w:val="left"/>
+      <w:pPr>
+        <w:ind w:left="2160" w:hanging="360"/>
+      </w:pPr>
+    </w:lvl>
+    <w:lvl w:ilvl="3" w:tplc="ABC4E8F2" w:tentative="1">
+      <w:start w:val="1"/>
+      <w:numFmt w:val="bullet"/>
+      <w:lvlText w:val="●"/>
+      <w:lvlJc w:val="left"/>
+      <w:pPr>
+        <w:ind w:left="2880" w:hanging="360"/>
+      </w:pPr>
+    </w:lvl>
+    <w:lvl w:ilvl="4" w:tplc="101086D0" w:tentative="1">
+      <w:start w:val="1"/>
+      <w:numFmt w:val="bullet"/>
+      <w:lvlText w:val="○"/>
+      <w:lvlJc w:val="left"/>
+      <w:pPr>
+        <w:ind w:left="3600" w:hanging="360"/>
+      </w:pPr>
+    </w:lvl>
+    <w:lvl w:ilvl="5" w:tplc="6AEA129E" w:tentative="1">
+      <w:start w:val="1"/>
+      <w:numFmt w:val="bullet"/>
+      <w:lvlText w:val="■"/>
+      <w:lvlJc w:val="left"/>
+      <w:pPr>
+        <w:ind w:left="4320" w:hanging="360"/>
+      </w:pPr>
+    </w:lvl>
+    <w:lvl w:ilvl="6" w:tplc="B71055AC" w:tentative="1">
+      <w:start w:val="1"/>
+      <w:numFmt w:val="bullet"/>
+      <w:lvlText w:val="●"/>
+      <w:lvlJc w:val="left"/>
+      <w:pPr>
+        <w:ind w:left="5040" w:hanging="360"/>
+      </w:pPr>
+    </w:lvl>
+    <w:lvl w:ilvl="7" w:tplc="0BF037C6" w:tentative="1">
+      <w:start w:val="1"/>
+      <w:numFmt w:val="bullet"/>
+      <w:lvlText w:val="●"/>
+      <w:lvlJc w:val="left"/>
+      <w:pPr>
+        <w:ind w:left="5760" w:hanging="360"/>
+      </w:pPr>
+    </w:lvl>
+    <w:lvl w:ilvl="8" w:tplc="35322864" w:tentative="1">
+      <w:start w:val="1"/>
+      <w:numFmt w:val="bullet"/>
+      <w:lvlText w:val="●"/>
+      <w:lvlJc w:val="left"/>
+      <w:pPr>
+        <w:ind w:left="6480" w:hanging="360"/>
+      </w:pPr>
+    </w:lvl>
+  </w:abstractNum>
+  <w:abstractNum w:abstractNumId="2" w15:restartNumberingAfterBreak="0">
+    <w:nsid w:val="26937D1C"/>
+    <w:multiLevelType w:val="hybridMultilevel"/>
+    <w:tmpl w:val="BD90CE90"/>
+    <w:lvl w:ilvl="0" w:tplc="046613DC">
       <w:start w:val="1"/>
       <w:numFmt w:val="decimal"/>
       <w:lvlText w:val="%1."/>
@@ -20804,207 +20890,121 @@
         <w:ind w:left="540" w:hanging="300"/>
       </w:pPr>
     </w:lvl>
-    <w:lvl w:ilvl="1" w:tplc="C1A2FE00">
+    <w:lvl w:ilvl="1" w:tplc="38A0C540">
       <w:numFmt w:val="decimal"/>
       <w:lvlText w:val=""/>
       <w:lvlJc w:val="left"/>
     </w:lvl>
-    <w:lvl w:ilvl="2" w:tplc="C9660C8E">
+    <w:lvl w:ilvl="2" w:tplc="D8A6E4EE">
       <w:numFmt w:val="decimal"/>
       <w:lvlText w:val=""/>
       <w:lvlJc w:val="left"/>
     </w:lvl>
-    <w:lvl w:ilvl="3" w:tplc="E6E807FA">
+    <w:lvl w:ilvl="3" w:tplc="1DE66DE6">
       <w:numFmt w:val="decimal"/>
       <w:lvlText w:val=""/>
       <w:lvlJc w:val="left"/>
     </w:lvl>
-    <w:lvl w:ilvl="4" w:tplc="5D029E2A">
+    <w:lvl w:ilvl="4" w:tplc="822682B0">
       <w:numFmt w:val="decimal"/>
       <w:lvlText w:val=""/>
       <w:lvlJc w:val="left"/>
     </w:lvl>
-    <w:lvl w:ilvl="5" w:tplc="4440B1F4">
+    <w:lvl w:ilvl="5" w:tplc="24EA73EE">
       <w:numFmt w:val="decimal"/>
       <w:lvlText w:val=""/>
       <w:lvlJc w:val="left"/>
     </w:lvl>
-    <w:lvl w:ilvl="6" w:tplc="5B7C1064">
+    <w:lvl w:ilvl="6" w:tplc="DE84E84A">
       <w:numFmt w:val="decimal"/>
       <w:lvlText w:val=""/>
       <w:lvlJc w:val="left"/>
     </w:lvl>
-    <w:lvl w:ilvl="7" w:tplc="41EC5534">
+    <w:lvl w:ilvl="7" w:tplc="E5AA63AA">
       <w:numFmt w:val="decimal"/>
       <w:lvlText w:val=""/>
       <w:lvlJc w:val="left"/>
     </w:lvl>
-    <w:lvl w:ilvl="8" w:tplc="1262A0E0">
-      <w:numFmt w:val="decimal"/>
-      <w:lvlText w:val=""/>
-      <w:lvlJc w:val="left"/>
-    </w:lvl>
-  </w:abstractNum>
-  <w:abstractNum w:abstractNumId="2" w15:restartNumberingAfterBreak="0">
-    <w:nsid w:val="5B435B13"/>
-    <w:multiLevelType w:val="hybridMultilevel"/>
-    <w:tmpl w:val="6A629D16"/>
-    <w:lvl w:ilvl="0" w:tplc="F56E08F6">
-      <w:start w:val="1"/>
-      <w:numFmt w:val="bullet"/>
-      <w:lvlText w:val="•"/>
-      <w:lvlJc w:val="left"/>
-      <w:pPr>
-        <w:ind w:left="540" w:hanging="270"/>
-      </w:pPr>
-    </w:lvl>
-    <w:lvl w:ilvl="1" w:tplc="41248CB8">
-      <w:numFmt w:val="decimal"/>
-      <w:lvlText w:val=""/>
-      <w:lvlJc w:val="left"/>
-    </w:lvl>
-    <w:lvl w:ilvl="2" w:tplc="E1260F66">
-      <w:numFmt w:val="decimal"/>
-      <w:lvlText w:val=""/>
-      <w:lvlJc w:val="left"/>
-    </w:lvl>
-    <w:lvl w:ilvl="3" w:tplc="3AD44B52">
-      <w:numFmt w:val="decimal"/>
-      <w:lvlText w:val=""/>
-      <w:lvlJc w:val="left"/>
-    </w:lvl>
-    <w:lvl w:ilvl="4" w:tplc="0C009BF4">
-      <w:numFmt w:val="decimal"/>
-      <w:lvlText w:val=""/>
-      <w:lvlJc w:val="left"/>
-    </w:lvl>
-    <w:lvl w:ilvl="5" w:tplc="8DFC703C">
-      <w:numFmt w:val="decimal"/>
-      <w:lvlText w:val=""/>
-      <w:lvlJc w:val="left"/>
-    </w:lvl>
-    <w:lvl w:ilvl="6" w:tplc="2B82A528">
-      <w:numFmt w:val="decimal"/>
-      <w:lvlText w:val=""/>
-      <w:lvlJc w:val="left"/>
-    </w:lvl>
-    <w:lvl w:ilvl="7" w:tplc="97482DA8">
-      <w:numFmt w:val="decimal"/>
-      <w:lvlText w:val=""/>
-      <w:lvlJc w:val="left"/>
-    </w:lvl>
-    <w:lvl w:ilvl="8" w:tplc="F23EB358">
+    <w:lvl w:ilvl="8" w:tplc="D25A4CFA">
       <w:numFmt w:val="decimal"/>
       <w:lvlText w:val=""/>
       <w:lvlJc w:val="left"/>
     </w:lvl>
   </w:abstractNum>
   <w:abstractNum w:abstractNumId="3" w15:restartNumberingAfterBreak="0">
-    <w:nsid w:val="65DF799C"/>
+    <w:nsid w:val="60BF536B"/>
     <w:multiLevelType w:val="hybridMultilevel"/>
-    <w:tmpl w:val="5882E5A8"/>
-    <w:lvl w:ilvl="0" w:tplc="FDEA844A" w:tentative="1">
+    <w:tmpl w:val="F490F5B0"/>
+    <w:lvl w:ilvl="0" w:tplc="EB9EA09E">
       <w:start w:val="1"/>
-      <w:numFmt w:val="bullet"/>
-      <w:lvlText w:val="●"/>
+      <w:numFmt w:val="decimal"/>
+      <w:lvlText w:val="%1."/>
       <w:lvlJc w:val="left"/>
       <w:pPr>
-        <w:ind w:left="720" w:hanging="360"/>
+        <w:ind w:left="540" w:hanging="300"/>
       </w:pPr>
     </w:lvl>
-    <w:lvl w:ilvl="1" w:tplc="A9F0EAB4" w:tentative="1">
-      <w:start w:val="1"/>
-      <w:numFmt w:val="bullet"/>
-      <w:lvlText w:val="○"/>
+    <w:lvl w:ilvl="1" w:tplc="464AE4CC">
+      <w:numFmt w:val="decimal"/>
+      <w:lvlText w:val=""/>
       <w:lvlJc w:val="left"/>
-      <w:pPr>
-        <w:ind w:left="1440" w:hanging="360"/>
-      </w:pPr>
     </w:lvl>
-    <w:lvl w:ilvl="2" w:tplc="AC72319C" w:tentative="1">
-      <w:start w:val="1"/>
-      <w:numFmt w:val="bullet"/>
-      <w:lvlText w:val="■"/>
+    <w:lvl w:ilvl="2" w:tplc="F38617C8">
+      <w:numFmt w:val="decimal"/>
+      <w:lvlText w:val=""/>
       <w:lvlJc w:val="left"/>
-      <w:pPr>
-        <w:ind w:left="2160" w:hanging="360"/>
-      </w:pPr>
     </w:lvl>
-    <w:lvl w:ilvl="3" w:tplc="77E2BA24" w:tentative="1">
-      <w:start w:val="1"/>
-      <w:numFmt w:val="bullet"/>
-      <w:lvlText w:val="●"/>
+    <w:lvl w:ilvl="3" w:tplc="B9B4D88C">
+      <w:numFmt w:val="decimal"/>
+      <w:lvlText w:val=""/>
       <w:lvlJc w:val="left"/>
-      <w:pPr>
-        <w:ind w:left="2880" w:hanging="360"/>
-      </w:pPr>
     </w:lvl>
-    <w:lvl w:ilvl="4" w:tplc="964C56F2" w:tentative="1">
-      <w:start w:val="1"/>
-      <w:numFmt w:val="bullet"/>
-      <w:lvlText w:val="○"/>
+    <w:lvl w:ilvl="4" w:tplc="0E22B51C">
+      <w:numFmt w:val="decimal"/>
+      <w:lvlText w:val=""/>
       <w:lvlJc w:val="left"/>
-      <w:pPr>
-        <w:ind w:left="3600" w:hanging="360"/>
-      </w:pPr>
     </w:lvl>
-    <w:lvl w:ilvl="5" w:tplc="E214AC3A" w:tentative="1">
-      <w:start w:val="1"/>
-      <w:numFmt w:val="bullet"/>
-      <w:lvlText w:val="■"/>
+    <w:lvl w:ilvl="5" w:tplc="A8904B24">
+      <w:numFmt w:val="decimal"/>
+      <w:lvlText w:val=""/>
       <w:lvlJc w:val="left"/>
-      <w:pPr>
-        <w:ind w:left="4320" w:hanging="360"/>
-      </w:pPr>
     </w:lvl>
-    <w:lvl w:ilvl="6" w:tplc="BAA25902" w:tentative="1">
-      <w:start w:val="1"/>
-      <w:numFmt w:val="bullet"/>
-      <w:lvlText w:val="●"/>
+    <w:lvl w:ilvl="6" w:tplc="1DB654DA">
+      <w:numFmt w:val="decimal"/>
+      <w:lvlText w:val=""/>
       <w:lvlJc w:val="left"/>
-      <w:pPr>
-        <w:ind w:left="5040" w:hanging="360"/>
-      </w:pPr>
     </w:lvl>
-    <w:lvl w:ilvl="7" w:tplc="F8C2E9B2" w:tentative="1">
-      <w:start w:val="1"/>
-      <w:numFmt w:val="bullet"/>
-      <w:lvlText w:val="●"/>
+    <w:lvl w:ilvl="7" w:tplc="9A74CB32">
+      <w:numFmt w:val="decimal"/>
+      <w:lvlText w:val=""/>
       <w:lvlJc w:val="left"/>
-      <w:pPr>
-        <w:ind w:left="5760" w:hanging="360"/>
-      </w:pPr>
     </w:lvl>
-    <w:lvl w:ilvl="8" w:tplc="E4701C62" w:tentative="1">
-      <w:start w:val="1"/>
-      <w:numFmt w:val="bullet"/>
-      <w:lvlText w:val="●"/>
+    <w:lvl w:ilvl="8" w:tplc="EE5A8276">
+      <w:numFmt w:val="decimal"/>
+      <w:lvlText w:val=""/>
       <w:lvlJc w:val="left"/>
-      <w:pPr>
-        <w:ind w:left="6480" w:hanging="360"/>
-      </w:pPr>
     </w:lvl>
   </w:abstractNum>
-  <w:num w:numId="1" w16cid:durableId="536351337">
-    <w:abstractNumId w:val="3"/>
+  <w:num w:numId="1" w16cid:durableId="1330332578">
+    <w:abstractNumId w:val="1"/>
     <w:lvlOverride w:ilvl="0">
       <w:startOverride w:val="1"/>
     </w:lvlOverride>
   </w:num>
-  <w:num w:numId="2" w16cid:durableId="683554572">
+  <w:num w:numId="2" w16cid:durableId="934675445">
+    <w:abstractNumId w:val="0"/>
+    <w:lvlOverride w:ilvl="0">
+      <w:startOverride w:val="1"/>
+    </w:lvlOverride>
+  </w:num>
+  <w:num w:numId="3" w16cid:durableId="509028587">
     <w:abstractNumId w:val="2"/>
     <w:lvlOverride w:ilvl="0">
       <w:startOverride w:val="1"/>
     </w:lvlOverride>
   </w:num>
-  <w:num w:numId="3" w16cid:durableId="57871062">
-    <w:abstractNumId w:val="0"/>
-    <w:lvlOverride w:ilvl="0">
-      <w:startOverride w:val="1"/>
-    </w:lvlOverride>
-  </w:num>
-  <w:num w:numId="4" w16cid:durableId="961690827">
-    <w:abstractNumId w:val="1"/>
+  <w:num w:numId="4" w16cid:durableId="1620452799">
+    <w:abstractNumId w:val="3"/>
     <w:lvlOverride w:ilvl="0">
       <w:startOverride w:val="1"/>
     </w:lvlOverride>
@@ -21645,7 +21645,7 @@
     <w:autoRedefine/>
     <w:uiPriority w:val="39"/>
     <w:unhideWhenUsed/>
-    <w:rsid w:val="00AD4949"/>
+    <w:rsid w:val="00702157"/>
     <w:pPr>
       <w:spacing w:after="100"/>
     </w:pPr>
@@ -21657,7 +21657,7 @@
     <w:autoRedefine/>
     <w:uiPriority w:val="39"/>
     <w:unhideWhenUsed/>
-    <w:rsid w:val="00AD4949"/>
+    <w:rsid w:val="00702157"/>
     <w:pPr>
       <w:spacing w:after="100"/>
       <w:ind w:left="210"/>

</xml_diff>